<commit_message>
Iniciación de DIAGNOSTICO_INFORMATICO y Propuesta de departament de informática en SILAIS Masaya
</commit_message>
<xml_diff>
--- a/Tareas realizadas Word/Tema  2 y Caso Practico.docx
+++ b/Tareas realizadas Word/Tema  2 y Caso Practico.docx
@@ -9,6 +9,8 @@
           <w:rFonts w:eastAsia="Times New Roman"/>
         </w:rPr>
       </w:pPr>
+      <w:bookmarkStart w:id="0" w:name="_GoBack"/>
+      <w:bookmarkEnd w:id="0"/>
       <w:r>
         <w:rPr>
           <w:noProof/>
@@ -4234,8 +4236,8 @@
           <w:szCs w:val="22"/>
         </w:rPr>
       </w:pPr>
-      <w:bookmarkStart w:id="0" w:name="_txa6c6uzivfq" w:colFirst="0" w:colLast="0"/>
-      <w:bookmarkEnd w:id="0"/>
+      <w:bookmarkStart w:id="1" w:name="_txa6c6uzivfq" w:colFirst="0" w:colLast="0"/>
+      <w:bookmarkEnd w:id="1"/>
       <w:r>
         <w:rPr>
           <w:sz w:val="22"/>
@@ -4272,8 +4274,8 @@
           <w:szCs w:val="22"/>
         </w:rPr>
       </w:pPr>
-      <w:bookmarkStart w:id="1" w:name="_1qtqgwpob5r3" w:colFirst="0" w:colLast="0"/>
-      <w:bookmarkEnd w:id="1"/>
+      <w:bookmarkStart w:id="2" w:name="_1qtqgwpob5r3" w:colFirst="0" w:colLast="0"/>
+      <w:bookmarkEnd w:id="2"/>
       <w:r>
         <w:rPr>
           <w:color w:val="000000"/>
@@ -4333,8 +4335,8 @@
           <w:szCs w:val="22"/>
         </w:rPr>
       </w:pPr>
-      <w:bookmarkStart w:id="2" w:name="_ilcs91vgpxi6" w:colFirst="0" w:colLast="0"/>
-      <w:bookmarkEnd w:id="2"/>
+      <w:bookmarkStart w:id="3" w:name="_ilcs91vgpxi6" w:colFirst="0" w:colLast="0"/>
+      <w:bookmarkEnd w:id="3"/>
       <w:r>
         <w:rPr>
           <w:color w:val="000000"/>
@@ -4418,8 +4420,8 @@
           <w:szCs w:val="22"/>
         </w:rPr>
       </w:pPr>
-      <w:bookmarkStart w:id="3" w:name="_8q52bwfkj6u0" w:colFirst="0" w:colLast="0"/>
-      <w:bookmarkEnd w:id="3"/>
+      <w:bookmarkStart w:id="4" w:name="_8q52bwfkj6u0" w:colFirst="0" w:colLast="0"/>
+      <w:bookmarkEnd w:id="4"/>
       <w:r>
         <w:rPr>
           <w:color w:val="000000"/>
@@ -4487,8 +4489,8 @@
           <w:szCs w:val="22"/>
         </w:rPr>
       </w:pPr>
-      <w:bookmarkStart w:id="4" w:name="_psrwegiy55ot" w:colFirst="0" w:colLast="0"/>
-      <w:bookmarkEnd w:id="4"/>
+      <w:bookmarkStart w:id="5" w:name="_psrwegiy55ot" w:colFirst="0" w:colLast="0"/>
+      <w:bookmarkEnd w:id="5"/>
       <w:r>
         <w:rPr>
           <w:b/>
@@ -4527,8 +4529,8 @@
           <w:szCs w:val="22"/>
         </w:rPr>
       </w:pPr>
-      <w:bookmarkStart w:id="5" w:name="_5vgbyn167jco" w:colFirst="0" w:colLast="0"/>
-      <w:bookmarkEnd w:id="5"/>
+      <w:bookmarkStart w:id="6" w:name="_5vgbyn167jco" w:colFirst="0" w:colLast="0"/>
+      <w:bookmarkEnd w:id="6"/>
       <w:r>
         <w:rPr>
           <w:color w:val="000000"/>
@@ -4580,8 +4582,8 @@
           <w:szCs w:val="22"/>
         </w:rPr>
       </w:pPr>
-      <w:bookmarkStart w:id="6" w:name="_quw7sz3g4u8j" w:colFirst="0" w:colLast="0"/>
-      <w:bookmarkEnd w:id="6"/>
+      <w:bookmarkStart w:id="7" w:name="_quw7sz3g4u8j" w:colFirst="0" w:colLast="0"/>
+      <w:bookmarkEnd w:id="7"/>
       <w:r>
         <w:rPr>
           <w:color w:val="000000"/>
@@ -4650,8 +4652,8 @@
           <w:szCs w:val="22"/>
         </w:rPr>
       </w:pPr>
-      <w:bookmarkStart w:id="7" w:name="_5dhwqg58plnv" w:colFirst="0" w:colLast="0"/>
-      <w:bookmarkEnd w:id="7"/>
+      <w:bookmarkStart w:id="8" w:name="_5dhwqg58plnv" w:colFirst="0" w:colLast="0"/>
+      <w:bookmarkEnd w:id="8"/>
       <w:r>
         <w:rPr>
           <w:color w:val="000000"/>
@@ -4742,8 +4744,8 @@
           <w:szCs w:val="22"/>
         </w:rPr>
       </w:pPr>
-      <w:bookmarkStart w:id="8" w:name="_2astaxvrxz4" w:colFirst="0" w:colLast="0"/>
-      <w:bookmarkEnd w:id="8"/>
+      <w:bookmarkStart w:id="9" w:name="_2astaxvrxz4" w:colFirst="0" w:colLast="0"/>
+      <w:bookmarkEnd w:id="9"/>
       <w:r>
         <w:rPr>
           <w:b/>
@@ -4774,8 +4776,8 @@
           <w:szCs w:val="22"/>
         </w:rPr>
       </w:pPr>
-      <w:bookmarkStart w:id="9" w:name="_exhafattnhrs" w:colFirst="0" w:colLast="0"/>
-      <w:bookmarkEnd w:id="9"/>
+      <w:bookmarkStart w:id="10" w:name="_exhafattnhrs" w:colFirst="0" w:colLast="0"/>
+      <w:bookmarkEnd w:id="10"/>
       <w:r>
         <w:rPr>
           <w:color w:val="000000"/>
@@ -4858,8 +4860,8 @@
           <w:szCs w:val="22"/>
         </w:rPr>
       </w:pPr>
-      <w:bookmarkStart w:id="10" w:name="_p6zzej2newwk" w:colFirst="0" w:colLast="0"/>
-      <w:bookmarkEnd w:id="10"/>
+      <w:bookmarkStart w:id="11" w:name="_p6zzej2newwk" w:colFirst="0" w:colLast="0"/>
+      <w:bookmarkEnd w:id="11"/>
       <w:r>
         <w:rPr>
           <w:color w:val="000000"/>
@@ -4974,8 +4976,8 @@
           <w:szCs w:val="22"/>
         </w:rPr>
       </w:pPr>
-      <w:bookmarkStart w:id="11" w:name="_tk89qahdh6w3" w:colFirst="0" w:colLast="0"/>
-      <w:bookmarkEnd w:id="11"/>
+      <w:bookmarkStart w:id="12" w:name="_tk89qahdh6w3" w:colFirst="0" w:colLast="0"/>
+      <w:bookmarkEnd w:id="12"/>
       <w:r>
         <w:rPr>
           <w:b/>
@@ -5006,8 +5008,8 @@
           <w:szCs w:val="22"/>
         </w:rPr>
       </w:pPr>
-      <w:bookmarkStart w:id="12" w:name="_7fiytzfi6wzb" w:colFirst="0" w:colLast="0"/>
-      <w:bookmarkEnd w:id="12"/>
+      <w:bookmarkStart w:id="13" w:name="_7fiytzfi6wzb" w:colFirst="0" w:colLast="0"/>
+      <w:bookmarkEnd w:id="13"/>
       <w:r>
         <w:rPr>
           <w:color w:val="000000"/>
@@ -5075,8 +5077,8 @@
           <w:szCs w:val="22"/>
         </w:rPr>
       </w:pPr>
-      <w:bookmarkStart w:id="13" w:name="_m55qal3sa1q9" w:colFirst="0" w:colLast="0"/>
-      <w:bookmarkEnd w:id="13"/>
+      <w:bookmarkStart w:id="14" w:name="_m55qal3sa1q9" w:colFirst="0" w:colLast="0"/>
+      <w:bookmarkEnd w:id="14"/>
       <w:r>
         <w:rPr>
           <w:color w:val="000000"/>
@@ -5899,8 +5901,8 @@
           <w:szCs w:val="22"/>
         </w:rPr>
       </w:pPr>
-      <w:bookmarkStart w:id="14" w:name="_vdjff3ww6ac" w:colFirst="0" w:colLast="0"/>
-      <w:bookmarkEnd w:id="14"/>
+      <w:bookmarkStart w:id="15" w:name="_vdjff3ww6ac" w:colFirst="0" w:colLast="0"/>
+      <w:bookmarkEnd w:id="15"/>
       <w:r>
         <w:rPr>
           <w:b/>
@@ -7656,7 +7658,6 @@
           <w:rFonts w:ascii="Arial" w:hAnsi="Arial" w:cs="Arial"/>
         </w:rPr>
       </w:pPr>
-      <w:bookmarkStart w:id="15" w:name="_GoBack"/>
       <w:r>
         <w:rPr>
           <w:rFonts w:ascii="Arial" w:hAnsi="Arial" w:cs="Arial"/>
@@ -7777,7 +7778,6 @@
         <w:t>gestión de incidentes y solicitudes. Estas acciones contribuirán a mejorar la organización del área tecnológica y a convertirla en un apoyo estratégico para el crecimiento y la competitividad de la empresa.</w:t>
       </w:r>
     </w:p>
-    <w:bookmarkEnd w:id="15"/>
     <w:p/>
     <w:sectPr>
       <w:pgSz w:w="11909" w:h="16834"/>

</xml_diff>